<commit_message>
Corrige la verificacion de firmas DGT
</commit_message>
<xml_diff>
--- a/plantillas/tramites_dgt/dgt_contrato_compraventa.docx
+++ b/plantillas/tramites_dgt/dgt_contrato_compraventa.docx
@@ -901,7 +901,7 @@
                 <w:color w:val="FFFFFF"/>
                 <w:sz w:val="36"/>
               </w:rPr>
-              <w:t>[[s|1                          ]]</w:t>
+              <w:t>[[s|0                          ]]</w:t>
             </w:r>
           </w:p>
         </w:tc>
@@ -930,7 +930,7 @@
                 <w:color w:val="FFFFFF"/>
                 <w:sz w:val="36"/>
               </w:rPr>
-              <w:t>[[s|2                          ]]</w:t>
+              <w:t>[[s|1                          ]]</w:t>
             </w:r>
           </w:p>
         </w:tc>

</xml_diff>